<commit_message>
docs: generated human-readable MuleSoft flow documentation
</commit_message>
<xml_diff>
--- a/MuleSoft-Flow-Documentation.docx
+++ b/MuleSoft-Flow-Documentation.docx
@@ -28,6 +28,579 @@
         <w:t>Auto-generated from extracted JAR contents</w:t>
       </w:r>
     </w:p>
+    <w:p>
+      <w:r>
+        <w:br w:type="page"/>
+      </w:r>
+    </w:p>
+    <w:p>
+      <w:pPr>
+        <w:pStyle w:val="Heading1"/>
+      </w:pPr>
+      <w:r>
+        <w:t>File: subflowsprivateflows.xml</w:t>
+      </w:r>
+    </w:p>
+    <w:p>
+      <w:pPr>
+        <w:pStyle w:val="Heading2"/>
+      </w:pPr>
+      <w:r>
+        <w:t>Flow: subflowsprivateflowsFlow</w:t>
+      </w:r>
+    </w:p>
+    <w:p>
+      <w:pPr>
+        <w:spacing w:after="40"/>
+      </w:pPr>
+      <w:r>
+        <w:rPr>
+          <w:b/>
+          <w:color w:val="1F497D"/>
+        </w:rPr>
+        <w:t xml:space="preserve">Source File: </w:t>
+      </w:r>
+      <w:r>
+        <w:t>subflowsprivateflows.xml</w:t>
+      </w:r>
+    </w:p>
+    <w:p>
+      <w:pPr>
+        <w:spacing w:after="40"/>
+      </w:pPr>
+      <w:r>
+        <w:rPr>
+          <w:b/>
+          <w:color w:val="1F497D"/>
+        </w:rPr>
+        <w:t xml:space="preserve">Flow Type: </w:t>
+      </w:r>
+      <w:r>
+        <w:t>Flow</w:t>
+      </w:r>
+    </w:p>
+    <w:p>
+      <w:pPr>
+        <w:pStyle w:val="Heading3"/>
+      </w:pPr>
+      <w:r>
+        <w:t>Overview</w:t>
+      </w:r>
+    </w:p>
+    <w:p>
+      <w:pPr>
+        <w:spacing w:after="160"/>
+      </w:pPr>
+      <w:r>
+        <w:t>This flow contains 5 processing steps. Triggered by: HTTP Listener — receives ANY requests at path '/subprivateflows'</w:t>
+      </w:r>
+    </w:p>
+    <w:p>
+      <w:pPr>
+        <w:pStyle w:val="Heading3"/>
+      </w:pPr>
+      <w:r>
+        <w:t>Trigger</w:t>
+      </w:r>
+    </w:p>
+    <w:p>
+      <w:pPr>
+        <w:spacing w:after="40"/>
+      </w:pPr>
+      <w:r>
+        <w:rPr>
+          <w:b/>
+          <w:color w:val="1F497D"/>
+        </w:rPr>
+        <w:t xml:space="preserve">Description: </w:t>
+      </w:r>
+      <w:r>
+        <w:t>HTTP Listener — receives ANY requests at path '/subprivateflows'</w:t>
+      </w:r>
+    </w:p>
+    <w:p>
+      <w:pPr>
+        <w:spacing w:after="40"/>
+      </w:pPr>
+      <w:r>
+        <w:rPr>
+          <w:b/>
+          <w:color w:val="1F497D"/>
+        </w:rPr>
+        <w:t xml:space="preserve">Config Reference: </w:t>
+      </w:r>
+      <w:r>
+        <w:t>HTTP_Listener_config</w:t>
+      </w:r>
+    </w:p>
+    <w:p>
+      <w:pPr>
+        <w:pStyle w:val="Heading3"/>
+      </w:pPr>
+      <w:r>
+        <w:t>Logic Steps</w:t>
+      </w:r>
+    </w:p>
+    <w:tbl>
+      <w:tblPr>
+        <w:tblStyle w:val="TableGrid"/>
+        <w:tblW w:type="auto" w:w="0"/>
+        <w:tblLook w:firstColumn="1" w:firstRow="1" w:lastColumn="0" w:lastRow="0" w:noHBand="0" w:noVBand="1" w:val="04A0"/>
+      </w:tblPr>
+      <w:tblGrid>
+        <w:gridCol w:w="4320"/>
+        <w:gridCol w:w="4320"/>
+      </w:tblGrid>
+      <w:tr>
+        <w:tc>
+          <w:tcPr>
+            <w:tcW w:type="dxa" w:w="720"/>
+            <w:shd w:val="clear" w:color="auto" w:fill="2E75B6"/>
+          </w:tcPr>
+          <w:p>
+            <w:r>
+              <w:rPr>
+                <w:b/>
+                <w:color w:val="FFFFFF"/>
+                <w:sz w:val="20"/>
+              </w:rPr>
+              <w:t>Step</w:t>
+            </w:r>
+          </w:p>
+        </w:tc>
+        <w:tc>
+          <w:tcPr>
+            <w:tcW w:type="dxa" w:w="7920"/>
+            <w:shd w:val="clear" w:color="auto" w:fill="2E75B6"/>
+          </w:tcPr>
+          <w:p>
+            <w:r>
+              <w:rPr>
+                <w:b/>
+                <w:color w:val="FFFFFF"/>
+                <w:sz w:val="20"/>
+              </w:rPr>
+              <w:t>What it does</w:t>
+            </w:r>
+          </w:p>
+        </w:tc>
+      </w:tr>
+      <w:tr>
+        <w:tc>
+          <w:tcPr>
+            <w:tcW w:type="dxa" w:w="720"/>
+            <w:shd w:val="clear" w:color="auto" w:fill="EBF3FB"/>
+          </w:tcPr>
+          <w:p>
+            <w:r>
+              <w:rPr>
+                <w:sz w:val="18"/>
+              </w:rPr>
+              <w:t>1</w:t>
+            </w:r>
+          </w:p>
+        </w:tc>
+        <w:tc>
+          <w:tcPr>
+            <w:tcW w:type="dxa" w:w="7920"/>
+            <w:shd w:val="clear" w:color="auto" w:fill="EBF3FB"/>
+          </w:tcPr>
+          <w:p>
+            <w:r>
+              <w:rPr>
+                <w:sz w:val="18"/>
+              </w:rPr>
+              <w:t>HTTP Listener — waits for incoming requests on path '/subprivateflows' [ANY]</w:t>
+            </w:r>
+          </w:p>
+        </w:tc>
+      </w:tr>
+      <w:tr>
+        <w:tc>
+          <w:tcPr>
+            <w:tcW w:type="dxa" w:w="720"/>
+            <w:shd w:val="clear" w:color="auto" w:fill="FFFFFF"/>
+          </w:tcPr>
+          <w:p>
+            <w:r>
+              <w:rPr>
+                <w:sz w:val="18"/>
+              </w:rPr>
+              <w:t>2</w:t>
+            </w:r>
+          </w:p>
+        </w:tc>
+        <w:tc>
+          <w:tcPr>
+            <w:tcW w:type="dxa" w:w="7920"/>
+            <w:shd w:val="clear" w:color="auto" w:fill="FFFFFF"/>
+          </w:tcPr>
+          <w:p>
+            <w:r>
+              <w:rPr>
+                <w:sz w:val="18"/>
+              </w:rPr>
+              <w:t xml:space="preserve">Logger — logs: Before setting the varaiable </w:t>
+            </w:r>
+          </w:p>
+        </w:tc>
+      </w:tr>
+      <w:tr>
+        <w:tc>
+          <w:tcPr>
+            <w:tcW w:type="dxa" w:w="720"/>
+            <w:shd w:val="clear" w:color="auto" w:fill="EBF3FB"/>
+          </w:tcPr>
+          <w:p>
+            <w:r>
+              <w:rPr>
+                <w:sz w:val="18"/>
+              </w:rPr>
+              <w:t>3</w:t>
+            </w:r>
+          </w:p>
+        </w:tc>
+        <w:tc>
+          <w:tcPr>
+            <w:tcW w:type="dxa" w:w="7920"/>
+            <w:shd w:val="clear" w:color="auto" w:fill="EBF3FB"/>
+          </w:tcPr>
+          <w:p>
+            <w:r>
+              <w:rPr>
+                <w:sz w:val="18"/>
+              </w:rPr>
+              <w:t>DataWeave Transform — transforms the message payload or variables</w:t>
+            </w:r>
+          </w:p>
+        </w:tc>
+      </w:tr>
+      <w:tr>
+        <w:tc>
+          <w:tcPr>
+            <w:tcW w:type="dxa" w:w="720"/>
+            <w:shd w:val="clear" w:color="auto" w:fill="FFFFFF"/>
+          </w:tcPr>
+          <w:p>
+            <w:r>
+              <w:rPr>
+                <w:sz w:val="18"/>
+              </w:rPr>
+              <w:t>4</w:t>
+            </w:r>
+          </w:p>
+        </w:tc>
+        <w:tc>
+          <w:tcPr>
+            <w:tcW w:type="dxa" w:w="7920"/>
+            <w:shd w:val="clear" w:color="auto" w:fill="FFFFFF"/>
+          </w:tcPr>
+          <w:p>
+            <w:r>
+              <w:rPr>
+                <w:sz w:val="18"/>
+              </w:rPr>
+              <w:t>Logger — logs: #[vars.parameter]</w:t>
+            </w:r>
+          </w:p>
+        </w:tc>
+      </w:tr>
+      <w:tr>
+        <w:tc>
+          <w:tcPr>
+            <w:tcW w:type="dxa" w:w="720"/>
+            <w:shd w:val="clear" w:color="auto" w:fill="EBF3FB"/>
+          </w:tcPr>
+          <w:p>
+            <w:r>
+              <w:rPr>
+                <w:sz w:val="18"/>
+              </w:rPr>
+              <w:t>5</w:t>
+            </w:r>
+          </w:p>
+        </w:tc>
+        <w:tc>
+          <w:tcPr>
+            <w:tcW w:type="dxa" w:w="7920"/>
+            <w:shd w:val="clear" w:color="auto" w:fill="EBF3FB"/>
+          </w:tcPr>
+          <w:p>
+            <w:r>
+              <w:rPr>
+                <w:sz w:val="18"/>
+              </w:rPr>
+              <w:t>Logger — logs: #[p('message')]</w:t>
+            </w:r>
+          </w:p>
+        </w:tc>
+      </w:tr>
+    </w:tbl>
+    <w:p/>
+    <w:p>
+      <w:pPr>
+        <w:pStyle w:val="Heading3"/>
+      </w:pPr>
+      <w:r>
+        <w:t>DataWeave Transformations</w:t>
+      </w:r>
+    </w:p>
+    <w:p>
+      <w:r>
+        <w:rPr>
+          <w:b/>
+          <w:color w:val="1F497D"/>
+        </w:rPr>
+        <w:t>Transform 1 — DataWeave transformation</w:t>
+      </w:r>
+    </w:p>
+    <w:p>
+      <w:pPr>
+        <w:spacing w:before="40" w:after="120"/>
+        <w:ind w:left="432"/>
+      </w:pPr>
+      <w:r>
+        <w:rPr>
+          <w:rFonts w:ascii="Courier New" w:hAnsi="Courier New"/>
+          <w:color w:val="1A1A1A"/>
+          <w:sz w:val="18"/>
+        </w:rPr>
+        <w:t>%dw 2.0</w:t>
+        <w:br/>
+        <w:t>var a=[</w:t>
+        <w:br/>
+        <w:t xml:space="preserve">    {</w:t>
+        <w:br/>
+        <w:t xml:space="preserve">    "name":"Balaji",</w:t>
+        <w:br/>
+        <w:t xml:space="preserve">    "id":1,</w:t>
+        <w:br/>
+        <w:t xml:space="preserve">    "org":"growth arc"</w:t>
+        <w:br/>
+        <w:t>},</w:t>
+        <w:br/>
+        <w:t>{</w:t>
+        <w:br/>
+        <w:t xml:space="preserve">    "name":"Balaji1",</w:t>
+        <w:br/>
+        <w:t xml:space="preserve">    "id":2,</w:t>
+        <w:br/>
+        <w:t xml:space="preserve">    "org":"growth arc"</w:t>
+        <w:br/>
+        <w:t>},</w:t>
+        <w:br/>
+        <w:t>{</w:t>
+        <w:br/>
+        <w:t xml:space="preserve">    "name":"Balaji2",</w:t>
+        <w:br/>
+        <w:t xml:space="preserve">    "id":3,</w:t>
+        <w:br/>
+        <w:t xml:space="preserve">    "org":"growth arc"</w:t>
+        <w:br/>
+        <w:t>}</w:t>
+        <w:br/>
+        <w:t>]</w:t>
+        <w:br/>
+        <w:t>output application/xml</w:t>
+        <w:br/>
+        <w:t>---</w:t>
+        <w:br/>
+        <w:t>hi: a</w:t>
+      </w:r>
+    </w:p>
+    <w:p>
+      <w:pPr>
+        <w:pStyle w:val="Heading3"/>
+      </w:pPr>
+      <w:r>
+        <w:t>Connectors Used</w:t>
+      </w:r>
+    </w:p>
+    <w:tbl>
+      <w:tblPr>
+        <w:tblStyle w:val="TableGrid"/>
+        <w:tblW w:type="auto" w:w="0"/>
+        <w:tblLook w:firstColumn="1" w:firstRow="1" w:lastColumn="0" w:lastRow="0" w:noHBand="0" w:noVBand="1" w:val="04A0"/>
+      </w:tblPr>
+      <w:tblGrid>
+        <w:gridCol w:w="4320"/>
+        <w:gridCol w:w="4320"/>
+      </w:tblGrid>
+      <w:tr>
+        <w:tc>
+          <w:tcPr>
+            <w:tcW w:type="dxa" w:w="3600"/>
+            <w:shd w:val="clear" w:color="auto" w:fill="2E75B6"/>
+          </w:tcPr>
+          <w:p>
+            <w:r>
+              <w:rPr>
+                <w:b/>
+                <w:color w:val="FFFFFF"/>
+                <w:sz w:val="20"/>
+              </w:rPr>
+              <w:t>Connector</w:t>
+            </w:r>
+          </w:p>
+        </w:tc>
+        <w:tc>
+          <w:tcPr>
+            <w:tcW w:type="dxa" w:w="5040"/>
+            <w:shd w:val="clear" w:color="auto" w:fill="2E75B6"/>
+          </w:tcPr>
+          <w:p>
+            <w:r>
+              <w:rPr>
+                <w:b/>
+                <w:color w:val="FFFFFF"/>
+                <w:sz w:val="20"/>
+              </w:rPr>
+              <w:t>Config Reference</w:t>
+            </w:r>
+          </w:p>
+        </w:tc>
+      </w:tr>
+      <w:tr>
+        <w:tc>
+          <w:tcPr>
+            <w:tcW w:type="dxa" w:w="3600"/>
+            <w:shd w:val="clear" w:color="auto" w:fill="EBF3FB"/>
+          </w:tcPr>
+          <w:p>
+            <w:r>
+              <w:rPr>
+                <w:sz w:val="18"/>
+              </w:rPr>
+              <w:t>http:listener</w:t>
+            </w:r>
+          </w:p>
+        </w:tc>
+        <w:tc>
+          <w:tcPr>
+            <w:tcW w:type="dxa" w:w="5040"/>
+            <w:shd w:val="clear" w:color="auto" w:fill="EBF3FB"/>
+          </w:tcPr>
+          <w:p>
+            <w:r>
+              <w:rPr>
+                <w:sz w:val="18"/>
+              </w:rPr>
+              <w:t>HTTP_Listener_config</w:t>
+            </w:r>
+          </w:p>
+        </w:tc>
+      </w:tr>
+    </w:tbl>
+    <w:p/>
+    <w:p>
+      <w:pPr>
+        <w:spacing w:before="80" w:after="80"/>
+        <w:pBdr>
+          <w:bottom w:val="single" w:sz="6" w:space="1" w:color="2E75B6"/>
+        </w:pBdr>
+      </w:pPr>
+    </w:p>
+    <w:p/>
+    <w:p>
+      <w:r>
+        <w:br w:type="page"/>
+      </w:r>
+    </w:p>
+    <w:p>
+      <w:pPr>
+        <w:pStyle w:val="Heading2"/>
+      </w:pPr>
+      <w:r>
+        <w:t>Flow: subflowsprivateflowsFlow1</w:t>
+      </w:r>
+    </w:p>
+    <w:p>
+      <w:pPr>
+        <w:spacing w:after="40"/>
+      </w:pPr>
+      <w:r>
+        <w:rPr>
+          <w:b/>
+          <w:color w:val="1F497D"/>
+        </w:rPr>
+        <w:t xml:space="preserve">Source File: </w:t>
+      </w:r>
+      <w:r>
+        <w:t>subflowsprivateflows.xml</w:t>
+      </w:r>
+    </w:p>
+    <w:p>
+      <w:pPr>
+        <w:spacing w:after="40"/>
+      </w:pPr>
+      <w:r>
+        <w:rPr>
+          <w:b/>
+          <w:color w:val="1F497D"/>
+        </w:rPr>
+        <w:t xml:space="preserve">Flow Type: </w:t>
+      </w:r>
+      <w:r>
+        <w:t>Flow</w:t>
+      </w:r>
+    </w:p>
+    <w:p>
+      <w:pPr>
+        <w:pStyle w:val="Heading3"/>
+      </w:pPr>
+      <w:r>
+        <w:t>Overview</w:t>
+      </w:r>
+    </w:p>
+    <w:p>
+      <w:pPr>
+        <w:spacing w:after="160"/>
+      </w:pPr>
+      <w:r>
+        <w:t>This flow contains 3 processing steps. Triggered by: mule:set-payload</w:t>
+      </w:r>
+    </w:p>
+    <w:p>
+      <w:pPr>
+        <w:pStyle w:val="Heading3"/>
+      </w:pPr>
+      <w:r>
+        <w:t>Trigger</w:t>
+      </w:r>
+    </w:p>
+    <w:p>
+      <w:pPr>
+        <w:spacing w:after="40"/>
+      </w:pPr>
+      <w:r>
+        <w:rPr>
+          <w:b/>
+          <w:color w:val="1F497D"/>
+        </w:rPr>
+        <w:t xml:space="preserve">Description: </w:t>
+      </w:r>
+      <w:r>
+        <w:t>mule:set-payload</w:t>
+      </w:r>
+    </w:p>
+    <w:p>
+      <w:pPr>
+        <w:pStyle w:val="Heading3"/>
+      </w:pPr>
+      <w:r>
+        <w:t>Logic Steps</w:t>
+      </w:r>
+    </w:p>
+    <w:p/>
+    <w:p>
+      <w:pPr>
+        <w:spacing w:before="80" w:after="80"/>
+        <w:pBdr>
+          <w:bottom w:val="single" w:sz="6" w:space="1" w:color="2E75B6"/>
+        </w:pBdr>
+      </w:pPr>
+    </w:p>
+    <w:p/>
     <w:p>
       <w:r>
         <w:br w:type="page"/>

</xml_diff>